<commit_message>
Drive workspace from selected official CPSC records
</commit_message>
<xml_diff>
--- a/public/CPSC_Regulatory_Analysis_Foundry_Methodology.docx
+++ b/public/CPSC_Regulatory_Analysis_Foundry_Methodology.docx
@@ -3111,7 +3111,7 @@
                 <w:rFonts w:ascii="Calibri" w:hAnsi="Calibri"/>
                 <w:sz w:val="19"/>
               </w:rPr>
-              <w:t>Issue review</w:t>
+              <w:t>Executive overview</w:t>
             </w:r>
           </w:p>
         </w:tc>
@@ -3135,7 +3135,7 @@
                 <w:rFonts w:ascii="Calibri" w:hAnsi="Calibri"/>
                 <w:sz w:val="19"/>
               </w:rPr>
-              <w:t>Functional prototype</w:t>
+              <w:t>Functional public-source query</w:t>
             </w:r>
           </w:p>
         </w:tc>
@@ -3159,7 +3159,7 @@
                 <w:rFonts w:ascii="Calibri" w:hAnsi="Calibri"/>
                 <w:sz w:val="19"/>
               </w:rPr>
-              <w:t>Users can select representative issues and inspect summaries, evidence-status labels, and representative mapped submissions.</w:t>
+              <w:t>Independently retrieves CPSC document records posted during the rolling three calendar months ending at retrieval, with official totals, supported type/cadence breakdowns, latest records, source, and caveats.</w:t>
             </w:r>
           </w:p>
         </w:tc>
@@ -3186,7 +3186,7 @@
                 <w:rFonts w:ascii="Calibri" w:hAnsi="Calibri"/>
                 <w:sz w:val="19"/>
               </w:rPr>
-              <w:t>Source view</w:t>
+              <w:t>Selected record</w:t>
             </w:r>
           </w:p>
         </w:tc>
@@ -3211,7 +3211,7 @@
                 <w:rFonts w:ascii="Calibri" w:hAnsi="Calibri"/>
                 <w:sz w:val="19"/>
               </w:rPr>
-              <w:t>Functional prototype with verified notice metadata</w:t>
+              <w:t>Functional live workspace state</w:t>
             </w:r>
           </w:p>
         </w:tc>
@@ -3236,7 +3236,7 @@
                 <w:rFonts w:ascii="Calibri" w:hAnsi="Calibri"/>
                 <w:sz w:val="19"/>
               </w:rPr>
-              <w:t>Users can switch to a notice/source panel; displayed excerpts must be labeled as excerpted or representative unless loaded from a verified snapshot.</w:t>
+              <w:t>A selected search result drives Overview context, Regulation metadata, docket comment lookup, evidence availability, draft notes, and QA. A new query or clear action removes stale state.</w:t>
             </w:r>
           </w:p>
         </w:tc>
@@ -3262,7 +3262,7 @@
                 <w:rFonts w:ascii="Calibri" w:hAnsi="Calibri"/>
                 <w:sz w:val="19"/>
               </w:rPr>
-              <w:t>Draft response editing</w:t>
+              <w:t>Public submissions</w:t>
             </w:r>
           </w:p>
         </w:tc>
@@ -3286,7 +3286,7 @@
                 <w:rFonts w:ascii="Calibri" w:hAnsi="Calibri"/>
                 <w:sz w:val="19"/>
               </w:rPr>
-              <w:t>Functional device-local interaction</w:t>
+              <w:t>Functional selected-docket query</w:t>
             </w:r>
           </w:p>
         </w:tc>
@@ -3310,7 +3310,158 @@
                 <w:rFonts w:ascii="Calibri" w:hAnsi="Calibri"/>
                 <w:sz w:val="19"/>
               </w:rPr>
-              <w:t>Users can edit draft text and choose return, flag, or ready-for-final-review dispositions; state remains in that browser and is not an agency record.</w:t>
+              <w:t>When a CPSC docket ID is available, the workspace paginates real public comment records from the Regulations.gov comments endpoint; it never substitutes samples.</w:t>
+            </w:r>
+          </w:p>
+        </w:tc>
+      </w:tr>
+      <w:tr>
+        <w:tc>
+          <w:tcPr>
+            <w:tcW w:type="dxa" w:w="2200"/>
+            <w:tcMar>
+              <w:top w:w="100" w:type="dxa"/>
+              <w:start w:w="120" w:type="dxa"/>
+              <w:bottom w:w="100" w:type="dxa"/>
+              <w:end w:w="120" w:type="dxa"/>
+            </w:tcMar>
+            <w:vAlign w:val="center"/>
+            <w:shd w:fill="F5F7F5"/>
+          </w:tcPr>
+          <w:p>
+            <w:pPr>
+              <w:spacing w:after="40" w:line="240" w:lineRule="auto"/>
+            </w:pPr>
+            <w:r>
+              <w:rPr>
+                <w:rFonts w:ascii="Calibri" w:hAnsi="Calibri"/>
+                <w:sz w:val="19"/>
+              </w:rPr>
+              <w:t>Issue analysis</w:t>
+            </w:r>
+          </w:p>
+        </w:tc>
+        <w:tc>
+          <w:tcPr>
+            <w:tcW w:type="dxa" w:w="2300"/>
+            <w:tcMar>
+              <w:top w:w="100" w:type="dxa"/>
+              <w:start w:w="120" w:type="dxa"/>
+              <w:bottom w:w="100" w:type="dxa"/>
+              <w:end w:w="120" w:type="dxa"/>
+            </w:tcMar>
+            <w:vAlign w:val="center"/>
+            <w:shd w:fill="F5F7F5"/>
+          </w:tcPr>
+          <w:p>
+            <w:pPr>
+              <w:spacing w:after="40" w:line="240" w:lineRule="auto"/>
+            </w:pPr>
+            <w:r>
+              <w:rPr>
+                <w:rFonts w:ascii="Calibri" w:hAnsi="Calibri"/>
+                <w:sz w:val="19"/>
+              </w:rPr>
+              <w:t>Explicitly unavailable without evidence</w:t>
+            </w:r>
+          </w:p>
+        </w:tc>
+        <w:tc>
+          <w:tcPr>
+            <w:tcW w:type="dxa" w:w="4860"/>
+            <w:tcMar>
+              <w:top w:w="100" w:type="dxa"/>
+              <w:start w:w="120" w:type="dxa"/>
+              <w:bottom w:w="100" w:type="dxa"/>
+              <w:end w:w="120" w:type="dxa"/>
+            </w:tcMar>
+            <w:vAlign w:val="center"/>
+            <w:shd w:fill="F5F7F5"/>
+          </w:tcPr>
+          <w:p>
+            <w:pPr>
+              <w:spacing w:after="40" w:line="240" w:lineRule="auto"/>
+            </w:pPr>
+            <w:r>
+              <w:rPr>
+                <w:rFonts w:ascii="Calibri" w:hAnsi="Calibri"/>
+                <w:sz w:val="19"/>
+              </w:rPr>
+              <w:t>The workspace shows verified metadata and source pointers but withholds topics, stances, and recommendations until a validated full-text and attachment evidence pipeline exists.</w:t>
+            </w:r>
+          </w:p>
+        </w:tc>
+      </w:tr>
+      <w:tr>
+        <w:tc>
+          <w:tcPr>
+            <w:tcW w:type="dxa" w:w="2200"/>
+            <w:tcMar>
+              <w:top w:w="100" w:type="dxa"/>
+              <w:start w:w="120" w:type="dxa"/>
+              <w:bottom w:w="100" w:type="dxa"/>
+              <w:end w:w="120" w:type="dxa"/>
+            </w:tcMar>
+            <w:vAlign w:val="center"/>
+          </w:tcPr>
+          <w:p>
+            <w:pPr>
+              <w:spacing w:after="40" w:line="240" w:lineRule="auto"/>
+            </w:pPr>
+            <w:r>
+              <w:rPr>
+                <w:rFonts w:ascii="Calibri" w:hAnsi="Calibri"/>
+                <w:sz w:val="19"/>
+              </w:rPr>
+              <w:t>Draft response</w:t>
+            </w:r>
+          </w:p>
+        </w:tc>
+        <w:tc>
+          <w:tcPr>
+            <w:tcW w:type="dxa" w:w="2300"/>
+            <w:tcMar>
+              <w:top w:w="100" w:type="dxa"/>
+              <w:start w:w="120" w:type="dxa"/>
+              <w:bottom w:w="100" w:type="dxa"/>
+              <w:end w:w="120" w:type="dxa"/>
+            </w:tcMar>
+            <w:vAlign w:val="center"/>
+          </w:tcPr>
+          <w:p>
+            <w:pPr>
+              <w:spacing w:after="40" w:line="240" w:lineRule="auto"/>
+            </w:pPr>
+            <w:r>
+              <w:rPr>
+                <w:rFonts w:ascii="Calibri" w:hAnsi="Calibri"/>
+                <w:sz w:val="19"/>
+              </w:rPr>
+              <w:t>Empty human-authored workspace</w:t>
+            </w:r>
+          </w:p>
+        </w:tc>
+        <w:tc>
+          <w:tcPr>
+            <w:tcW w:type="dxa" w:w="4860"/>
+            <w:tcMar>
+              <w:top w:w="100" w:type="dxa"/>
+              <w:start w:w="120" w:type="dxa"/>
+              <w:bottom w:w="100" w:type="dxa"/>
+              <w:end w:w="120" w:type="dxa"/>
+            </w:tcMar>
+            <w:vAlign w:val="center"/>
+          </w:tcPr>
+          <w:p>
+            <w:pPr>
+              <w:spacing w:after="40" w:line="240" w:lineRule="auto"/>
+            </w:pPr>
+            <w:r>
+              <w:rPr>
+                <w:rFonts w:ascii="Calibri" w:hAnsi="Calibri"/>
+                <w:sz w:val="19"/>
+              </w:rPr>
+              <w:t>Notes begin empty, are tied to the selected document ID, and persist only in that browser; they are not generated, source-grounded, or agency approved.</w:t>
             </w:r>
           </w:p>
         </w:tc>
@@ -3362,7 +3513,7 @@
                 <w:rFonts w:ascii="Calibri" w:hAnsi="Calibri"/>
                 <w:sz w:val="19"/>
               </w:rPr>
-              <w:t>Embedded onboarding</w:t>
+              <w:t>Embedded live onboarding</w:t>
             </w:r>
           </w:p>
         </w:tc>
@@ -3387,7 +3538,7 @@
                 <w:rFonts w:ascii="Calibri" w:hAnsi="Calibri"/>
                 <w:sz w:val="19"/>
               </w:rPr>
-              <w:t>Explains the intended query-to-review flow and the distinction between live public records and demo analysis.</w:t>
+              <w:t>Explains the current source flow and exact rolling three-calendar-month boundary.</w:t>
             </w:r>
           </w:p>
         </w:tc>
@@ -3628,7 +3779,7 @@
     </w:p>
     <w:p>
       <w:r>
-        <w:t>The deployed interface executes the bounded record-search portion of this journey. A query such as “burden reduction” searches CPSC document records posted during the rolling three calendar months ending on the retrieval date. The downstream comment ingestion, evidence analysis, issue matrix, and drafting pipeline remain representative or future production work, as shown below.</w:t>
+        <w:t>The deployed interface executes a bounded official-source research flow. A query such as “burden reduction” searches CPSC document records posted during the rolling three calendar months ending on the retrieval date. Selecting a result drives verified metadata and selected-docket comment lookup. Issue analysis is withheld, and the draft area begins empty, unless a future validated evidence pipeline is implemented.</w:t>
       </w:r>
     </w:p>
     <w:p>
@@ -3681,10 +3832,10 @@
         <w:rPr>
           <w:b/>
         </w:rPr>
-        <w:t xml:space="preserve">Analyze submissions: </w:t>
+        <w:t xml:space="preserve">List public submissions: </w:t>
       </w:r>
       <w:r>
-        <w:t>Process comments one at a time, attribute every extracted claim, and preserve the original passage.</w:t>
+        <w:t>When the selected record includes a docket ID, retrieve and paginate official public comment records. Do not infer comment positions from listing metadata.</w:t>
       </w:r>
     </w:p>
     <w:p>
@@ -3709,10 +3860,10 @@
         <w:rPr>
           <w:b/>
         </w:rPr>
-        <w:t xml:space="preserve">Build the issue matrix: </w:t>
+        <w:t xml:space="preserve">Withhold unsupported analysis: </w:t>
       </w:r>
       <w:r>
-        <w:t>Cluster proposals, map comments and positions, reconcile duplicates, and expose gaps or disagreement.</w:t>
+        <w:t>Show that automated issues and topics are not available when validated full text, attachments, and exact passage support have not been acquired.</w:t>
       </w:r>
     </w:p>
     <w:p>
@@ -3723,10 +3874,10 @@
         <w:rPr>
           <w:b/>
         </w:rPr>
-        <w:t xml:space="preserve">Validate evidence and counts: </w:t>
+        <w:t xml:space="preserve">Expose provenance and limits: </w:t>
       </w:r>
       <w:r>
-        <w:t>Check citations, attachment integrity, record counts, unsupported claims, provenance, and review-state violations.</w:t>
+        <w:t>Display source, retrieval time, exact rolling window, pagination, coverage limits, and source-backed empty or error states.</w:t>
       </w:r>
     </w:p>
     <w:p>
@@ -3737,10 +3888,10 @@
         <w:rPr>
           <w:b/>
         </w:rPr>
-        <w:t xml:space="preserve">Draft a recommendation: </w:t>
+        <w:t xml:space="preserve">Open a human draft: </w:t>
       </w:r>
       <w:r>
-        <w:t>Generate bounded draft language with caveats, evidence status, and unresolved legal/safety questions.</w:t>
+        <w:t>Provide an empty document-specific text area stored only in the current browser; do not imply that it was generated from the live record.</w:t>
       </w:r>
     </w:p>
     <w:p>
@@ -3751,10 +3902,10 @@
         <w:rPr>
           <w:b/>
         </w:rPr>
-        <w:t xml:space="preserve">Require human action: </w:t>
+        <w:t xml:space="preserve">Require authorized review: </w:t>
       </w:r>
       <w:r>
-        <w:t>An authorized reviewer edits, returns, flags, or approves for final review; the machine cannot approve agency policy.</w:t>
+        <w:t>Any later analysis or recommendation must be verified by authorized reviewers; the workspace cannot approve agency policy.</w:t>
       </w:r>
     </w:p>
     <w:p>
@@ -3814,10 +3965,10 @@
         <w:rPr>
           <w:b/>
         </w:rPr>
-        <w:t xml:space="preserve">Prototype limitations. </w:t>
+        <w:t xml:space="preserve">Workspace limitations. </w:t>
       </w:r>
       <w:r>
-        <w:t>The deployed workspace has a live bounded document search, but its comment analysis, issue matrix, evidence findings, and recommended responses are representative. It is not a system of record, does not execute the six agents or Temporal workflow, and does not make agency decisions.</w:t>
+        <w:t>The deployed workspace has live bounded document search, an independent executive overview, selected-record metadata, and selected-docket comment listing. It deliberately does not generate issue analysis or recommended responses without sufficient validated source text. It is not a system of record and does not make agency decisions.</w:t>
       </w:r>
     </w:p>
     <w:p>

</xml_diff>

<commit_message>
Polish live methodology pagination
</commit_message>
<xml_diff>
--- a/public/CPSC_Regulatory_Analysis_Foundry_Methodology.docx
+++ b/public/CPSC_Regulatory_Analysis_Foundry_Methodology.docx
@@ -72,6 +72,7 @@
       </w:tblGrid>
       <w:tr>
         <w:trPr>
+          <w:cantSplit/>
           <w:tblHeader/>
         </w:trPr>
         <w:tc>
@@ -154,6 +155,7 @@
       </w:tblGrid>
       <w:tr>
         <w:trPr>
+          <w:cantSplit/>
           <w:tblHeader/>
         </w:trPr>
         <w:tc>
@@ -221,6 +223,7 @@
       </w:tblGrid>
       <w:tr>
         <w:trPr>
+          <w:cantSplit/>
           <w:tblHeader/>
         </w:trPr>
         <w:tc>
@@ -306,6 +309,9 @@
         </w:tc>
       </w:tr>
       <w:tr>
+        <w:trPr>
+          <w:cantSplit/>
+        </w:trPr>
         <w:tc>
           <w:tcPr>
             <w:tcW w:type="dxa" w:w="1900"/>
@@ -380,6 +386,9 @@
         </w:tc>
       </w:tr>
       <w:tr>
+        <w:trPr>
+          <w:cantSplit/>
+        </w:trPr>
         <w:tc>
           <w:tcPr>
             <w:tcW w:type="dxa" w:w="1900"/>
@@ -457,6 +466,9 @@
         </w:tc>
       </w:tr>
       <w:tr>
+        <w:trPr>
+          <w:cantSplit/>
+        </w:trPr>
         <w:tc>
           <w:tcPr>
             <w:tcW w:type="dxa" w:w="1900"/>
@@ -531,6 +543,9 @@
         </w:tc>
       </w:tr>
       <w:tr>
+        <w:trPr>
+          <w:cantSplit/>
+        </w:trPr>
         <w:tc>
           <w:tcPr>
             <w:tcW w:type="dxa" w:w="1900"/>
@@ -608,6 +623,9 @@
         </w:tc>
       </w:tr>
       <w:tr>
+        <w:trPr>
+          <w:cantSplit/>
+        </w:trPr>
         <w:tc>
           <w:tcPr>
             <w:tcW w:type="dxa" w:w="1900"/>
@@ -744,6 +762,7 @@
       </w:tblGrid>
       <w:tr>
         <w:trPr>
+          <w:cantSplit/>
           <w:tblHeader/>
         </w:trPr>
         <w:tc>
@@ -816,6 +835,7 @@
       </w:tblGrid>
       <w:tr>
         <w:trPr>
+          <w:cantSplit/>
           <w:tblHeader/>
         </w:trPr>
         <w:tc>
@@ -901,6 +921,9 @@
         </w:tc>
       </w:tr>
       <w:tr>
+        <w:trPr>
+          <w:cantSplit/>
+        </w:trPr>
         <w:tc>
           <w:tcPr>
             <w:tcW w:type="dxa" w:w="1900"/>
@@ -975,6 +998,9 @@
         </w:tc>
       </w:tr>
       <w:tr>
+        <w:trPr>
+          <w:cantSplit/>
+        </w:trPr>
         <w:tc>
           <w:tcPr>
             <w:tcW w:type="dxa" w:w="1900"/>
@@ -1052,6 +1078,9 @@
         </w:tc>
       </w:tr>
       <w:tr>
+        <w:trPr>
+          <w:cantSplit/>
+        </w:trPr>
         <w:tc>
           <w:tcPr>
             <w:tcW w:type="dxa" w:w="1900"/>
@@ -1126,6 +1155,9 @@
         </w:tc>
       </w:tr>
       <w:tr>
+        <w:trPr>
+          <w:cantSplit/>
+        </w:trPr>
         <w:tc>
           <w:tcPr>
             <w:tcW w:type="dxa" w:w="1900"/>
@@ -1203,6 +1235,9 @@
         </w:tc>
       </w:tr>
       <w:tr>
+        <w:trPr>
+          <w:cantSplit/>
+        </w:trPr>
         <w:tc>
           <w:tcPr>
             <w:tcW w:type="dxa" w:w="1900"/>
@@ -1277,6 +1312,9 @@
         </w:tc>
       </w:tr>
       <w:tr>
+        <w:trPr>
+          <w:cantSplit/>
+        </w:trPr>
         <w:tc>
           <w:tcPr>
             <w:tcW w:type="dxa" w:w="1900"/>
@@ -1604,6 +1642,7 @@
       </w:tblGrid>
       <w:tr>
         <w:trPr>
+          <w:cantSplit/>
           <w:tblHeader/>
         </w:trPr>
         <w:tc>
@@ -1716,6 +1755,9 @@
         </w:tc>
       </w:tr>
       <w:tr>
+        <w:trPr>
+          <w:cantSplit/>
+        </w:trPr>
         <w:tc>
           <w:tcPr>
             <w:tcW w:type="dxa" w:w="1250"/>
@@ -1814,6 +1856,9 @@
         </w:tc>
       </w:tr>
       <w:tr>
+        <w:trPr>
+          <w:cantSplit/>
+        </w:trPr>
         <w:tc>
           <w:tcPr>
             <w:tcW w:type="dxa" w:w="1250"/>
@@ -1916,6 +1961,9 @@
         </w:tc>
       </w:tr>
       <w:tr>
+        <w:trPr>
+          <w:cantSplit/>
+        </w:trPr>
         <w:tc>
           <w:tcPr>
             <w:tcW w:type="dxa" w:w="1250"/>
@@ -2014,6 +2062,9 @@
         </w:tc>
       </w:tr>
       <w:tr>
+        <w:trPr>
+          <w:cantSplit/>
+        </w:trPr>
         <w:tc>
           <w:tcPr>
             <w:tcW w:type="dxa" w:w="1250"/>
@@ -2116,6 +2167,9 @@
         </w:tc>
       </w:tr>
       <w:tr>
+        <w:trPr>
+          <w:cantSplit/>
+        </w:trPr>
         <w:tc>
           <w:tcPr>
             <w:tcW w:type="dxa" w:w="1250"/>
@@ -2214,6 +2268,9 @@
         </w:tc>
       </w:tr>
       <w:tr>
+        <w:trPr>
+          <w:cantSplit/>
+        </w:trPr>
         <w:tc>
           <w:tcPr>
             <w:tcW w:type="dxa" w:w="1250"/>
@@ -2316,6 +2373,9 @@
         </w:tc>
       </w:tr>
       <w:tr>
+        <w:trPr>
+          <w:cantSplit/>
+        </w:trPr>
         <w:tc>
           <w:tcPr>
             <w:tcW w:type="dxa" w:w="1250"/>
@@ -2436,6 +2496,7 @@
       </w:tblGrid>
       <w:tr>
         <w:trPr>
+          <w:cantSplit/>
           <w:tblHeader/>
         </w:trPr>
         <w:tc>
@@ -2514,6 +2575,7 @@
       </w:tblGrid>
       <w:tr>
         <w:trPr>
+          <w:cantSplit/>
           <w:tblHeader/>
         </w:trPr>
         <w:tc>
@@ -2593,6 +2655,7 @@
       </w:tblGrid>
       <w:tr>
         <w:trPr>
+          <w:cantSplit/>
           <w:tblHeader/>
         </w:trPr>
         <w:tc>
@@ -2651,6 +2714,9 @@
         </w:tc>
       </w:tr>
       <w:tr>
+        <w:trPr>
+          <w:cantSplit/>
+        </w:trPr>
         <w:tc>
           <w:tcPr>
             <w:tcW w:type="dxa" w:w="2300"/>
@@ -2701,6 +2767,9 @@
         </w:tc>
       </w:tr>
       <w:tr>
+        <w:trPr>
+          <w:cantSplit/>
+        </w:trPr>
         <w:tc>
           <w:tcPr>
             <w:tcW w:type="dxa" w:w="2300"/>
@@ -2753,6 +2822,9 @@
         </w:tc>
       </w:tr>
       <w:tr>
+        <w:trPr>
+          <w:cantSplit/>
+        </w:trPr>
         <w:tc>
           <w:tcPr>
             <w:tcW w:type="dxa" w:w="2300"/>
@@ -2803,6 +2875,9 @@
         </w:tc>
       </w:tr>
       <w:tr>
+        <w:trPr>
+          <w:cantSplit/>
+        </w:trPr>
         <w:tc>
           <w:tcPr>
             <w:tcW w:type="dxa" w:w="2300"/>
@@ -2855,6 +2930,9 @@
         </w:tc>
       </w:tr>
       <w:tr>
+        <w:trPr>
+          <w:cantSplit/>
+        </w:trPr>
         <w:tc>
           <w:tcPr>
             <w:tcW w:type="dxa" w:w="2300"/>
@@ -3006,6 +3084,7 @@
       </w:tblGrid>
       <w:tr>
         <w:trPr>
+          <w:cantSplit/>
           <w:tblHeader/>
         </w:trPr>
         <w:tc>
@@ -3091,6 +3170,9 @@
         </w:tc>
       </w:tr>
       <w:tr>
+        <w:trPr>
+          <w:cantSplit/>
+        </w:trPr>
         <w:tc>
           <w:tcPr>
             <w:tcW w:type="dxa" w:w="2200"/>
@@ -3165,6 +3247,9 @@
         </w:tc>
       </w:tr>
       <w:tr>
+        <w:trPr>
+          <w:cantSplit/>
+        </w:trPr>
         <w:tc>
           <w:tcPr>
             <w:tcW w:type="dxa" w:w="2200"/>
@@ -3242,6 +3327,9 @@
         </w:tc>
       </w:tr>
       <w:tr>
+        <w:trPr>
+          <w:cantSplit/>
+        </w:trPr>
         <w:tc>
           <w:tcPr>
             <w:tcW w:type="dxa" w:w="2200"/>
@@ -3316,6 +3404,9 @@
         </w:tc>
       </w:tr>
       <w:tr>
+        <w:trPr>
+          <w:cantSplit/>
+        </w:trPr>
         <w:tc>
           <w:tcPr>
             <w:tcW w:type="dxa" w:w="2200"/>
@@ -3393,6 +3484,9 @@
         </w:tc>
       </w:tr>
       <w:tr>
+        <w:trPr>
+          <w:cantSplit/>
+        </w:trPr>
         <w:tc>
           <w:tcPr>
             <w:tcW w:type="dxa" w:w="2200"/>
@@ -3467,6 +3561,9 @@
         </w:tc>
       </w:tr>
       <w:tr>
+        <w:trPr>
+          <w:cantSplit/>
+        </w:trPr>
         <w:tc>
           <w:tcPr>
             <w:tcW w:type="dxa" w:w="2200"/>
@@ -3544,6 +3641,9 @@
         </w:tc>
       </w:tr>
       <w:tr>
+        <w:trPr>
+          <w:cantSplit/>
+        </w:trPr>
         <w:tc>
           <w:tcPr>
             <w:tcW w:type="dxa" w:w="2200"/>
@@ -3618,6 +3718,9 @@
         </w:tc>
       </w:tr>
       <w:tr>
+        <w:trPr>
+          <w:cantSplit/>
+        </w:trPr>
         <w:tc>
           <w:tcPr>
             <w:tcW w:type="dxa" w:w="2200"/>
@@ -3695,6 +3798,9 @@
         </w:tc>
       </w:tr>
       <w:tr>
+        <w:trPr>
+          <w:cantSplit/>
+        </w:trPr>
         <w:tc>
           <w:tcPr>
             <w:tcW w:type="dxa" w:w="2200"/>

</xml_diff>

<commit_message>
Expand CPSC search to 12 months and historical scope
</commit_message>
<xml_diff>
--- a/public/CPSC_Regulatory_Analysis_Foundry_Methodology.docx
+++ b/public/CPSC_Regulatory_Analysis_Foundry_Methodology.docx
@@ -3241,7 +3241,7 @@
                 <w:rFonts w:ascii="Calibri" w:hAnsi="Calibri"/>
                 <w:sz w:val="19"/>
               </w:rPr>
-              <w:t>Independently retrieves CPSC document records posted during the rolling three calendar months ending at retrieval, with official totals, supported type/cadence breakdowns, latest records, source, and caveats.</w:t>
+              <w:t>Independently retrieves CPSC document records posted during the rolling 12 months ending at retrieval, with official totals, supported type/cadence breakdowns, latest records, source, and caveats.</w:t>
             </w:r>
           </w:p>
         </w:tc>
@@ -3635,7 +3635,7 @@
                 <w:rFonts w:ascii="Calibri" w:hAnsi="Calibri"/>
                 <w:sz w:val="19"/>
               </w:rPr>
-              <w:t>Explains the current source flow and exact rolling three-calendar-month boundary.</w:t>
+              <w:t>Explains the current source flow, the default rolling 12-month boundary, and the optional all-available historical scope.</w:t>
             </w:r>
           </w:p>
         </w:tc>
@@ -3712,7 +3712,7 @@
                 <w:rFonts w:ascii="Calibri" w:hAnsi="Calibri"/>
                 <w:sz w:val="19"/>
               </w:rPr>
-              <w:t>A validated topic term is sent server-side to the Regulations.gov v4 documents endpoint with agency CPSC and a rolling three-calendar-month posted-date filter. Results include official links, retrieval time, pagination, and coverage limits.</w:t>
+              <w:t>A validated topic term is sent server-side to the Regulations.gov v4 documents endpoint with agency CPSC. The default scope applies a rolling 12-month posted-date filter; the user may instead select all available CPSC records, which omits that date filter. Results include official links, retrieval time, selected scope, pagination, and coverage limits.</w:t>
             </w:r>
           </w:p>
         </w:tc>
@@ -3885,7 +3885,7 @@
     </w:p>
     <w:p>
       <w:r>
-        <w:t>The deployed interface executes a bounded official-source research flow. A query such as “burden reduction” searches CPSC document records posted during the rolling three calendar months ending on the retrieval date. Selecting a result drives verified metadata and selected-docket comment lookup. Issue analysis is withheld, and the draft area begins empty, unless a future validated evidence pipeline is implemented.</w:t>
+        <w:t>The deployed interface executes an official-source research flow. By default, a query searches CPSC document records posted during the rolling 12 months ending on the retrieval date. For older topics—such as a notice that predates that window—the user may select “All available CPSC records,” which submits the same official query without a posted-date filter. Selecting a result drives verified metadata and selected-docket comment lookup. Issue analysis is withheld, and the draft area begins empty, unless a future validated evidence pipeline is implemented.</w:t>
       </w:r>
     </w:p>
     <w:p>
@@ -3896,10 +3896,10 @@
         <w:rPr>
           <w:b/>
         </w:rPr>
-        <w:t xml:space="preserve">Run the bounded live search: </w:t>
+        <w:t xml:space="preserve">Run the live search: </w:t>
       </w:r>
       <w:r>
-        <w:t>Validate a 2–80 character topic term and query the Regulations.gov documents endpoint with agency=CPSC and postedDate greater than or equal to the date three calendar months before retrieval. Display at most 20 records per page and the first five pages.</w:t>
+        <w:t>Validate a 2–80 character topic term and query the Regulations.gov documents endpoint with agency=CPSC. In the default scope, apply postedDate greater than or equal to the date 12 calendar months before retrieval. In the all-available scope, omit the posted-date filter. Display at most 20 records per page and the first five pages, and label the selected scope.</w:t>
       </w:r>
     </w:p>
     <w:p>
@@ -4030,7 +4030,7 @@
         <w:t xml:space="preserve">Public-source limitations. </w:t>
       </w:r>
       <w:r>
-        <w:t>Live search covers the Regulations.gov documents endpoint for CPSC records in a rolling three-calendar-month window, with 20 records per page and at most five pages. It does not claim complete coverage of comments, attachments, older records, or every CPSC publication. Records can be corrected, withdrawn, or posted after retrieval.</w:t>
+        <w:t>Live search covers the Regulations.gov documents endpoint for CPSC records, with a default rolling 12-month scope and an optional all-available scope, 20 records per page, and at most five pages. “All available” means the official API query has no posted-date filter; it does not guarantee every historical CPSC publication or overcome API indexing and pagination limits. The workspace does not claim complete coverage of comments or attachments. Records can be corrected, withdrawn, or posted after retrieval.</w:t>
       </w:r>
     </w:p>
     <w:p>

</xml_diff>

<commit_message>
Add official fallback for CPSC live data
</commit_message>
<xml_diff>
--- a/public/CPSC_Regulatory_Analysis_Foundry_Methodology.docx
+++ b/public/CPSC_Regulatory_Analysis_Foundry_Methodology.docx
@@ -3241,7 +3241,7 @@
                 <w:rFonts w:ascii="Calibri" w:hAnsi="Calibri"/>
                 <w:sz w:val="19"/>
               </w:rPr>
-              <w:t>Independently retrieves CPSC document records posted during the rolling 12 months ending at retrieval, with official totals, supported type/cadence breakdowns, latest records, source, and caveats.</w:t>
+              <w:t>Independently retrieves CPSC document records posted during the rolling 12 months ending at retrieval, with official totals, supported type/cadence breakdowns, latest records, source, and caveats. If Regulations.gov is rate-limited or unavailable, an explicitly identified FederalRegister.gov fallback supplies the narrower Federal Register record view.</w:t>
             </w:r>
           </w:p>
         </w:tc>
@@ -3712,7 +3712,7 @@
                 <w:rFonts w:ascii="Calibri" w:hAnsi="Calibri"/>
                 <w:sz w:val="19"/>
               </w:rPr>
-              <w:t>A validated topic term is sent server-side to the Regulations.gov v4 documents endpoint with agency CPSC. The default scope applies a rolling 12-month posted-date filter; the user may instead select all available CPSC records, which omits that date filter. Results include official links, retrieval time, selected scope, pagination, and coverage limits.</w:t>
+              <w:t>A validated topic term is sent server-side to the Regulations.gov v4 documents endpoint with agency CPSC. The default scope applies a rolling 12-month posted-date filter; the user may instead select all available CPSC records, which omits that date filter. If Regulations.gov is rate-limited or unavailable, the interface labels and uses an official FederalRegister.gov fallback, whose coverage is limited to Federal Register records. Results include official links, retrieval time, selected scope, pagination, and coverage limits.</w:t>
             </w:r>
           </w:p>
         </w:tc>
@@ -4030,7 +4030,7 @@
         <w:t xml:space="preserve">Public-source limitations. </w:t>
       </w:r>
       <w:r>
-        <w:t>Live search covers the Regulations.gov documents endpoint for CPSC records, with a default rolling 12-month scope and an optional all-available scope, 20 records per page, and at most five pages. “All available” means the official API query has no posted-date filter; it does not guarantee every historical CPSC publication or overcome API indexing and pagination limits. The workspace does not claim complete coverage of comments or attachments. Records can be corrected, withdrawn, or posted after retrieval.</w:t>
+        <w:t>Live search covers the Regulations.gov documents endpoint for CPSC records, with a default rolling 12-month scope and an optional all-available scope, 20 records per page, and at most five pages. “All available” means the official API query has no posted-date filter; it does not guarantee every historical CPSC publication or overcome API indexing and pagination limits. When Regulations.gov is rate-limited or unavailable, the labeled FederalRegister.gov fallback unions up to 1,000 matches for each of the first five query terms, removes duplicates, ranks title-term overlap, and exposes at most five pages; it covers Federal Register documents rather than all Regulations.gov document types. The workspace does not claim complete coverage of comments or attachments. Records can be corrected, withdrawn, or posted after retrieval.</w:t>
       </w:r>
     </w:p>
     <w:p>

</xml_diff>

<commit_message>
Make historical CPSC search source-explicit
</commit_message>
<xml_diff>
--- a/public/CPSC_Regulatory_Analysis_Foundry_Methodology.docx
+++ b/public/CPSC_Regulatory_Analysis_Foundry_Methodology.docx
@@ -3635,7 +3635,7 @@
                 <w:rFonts w:ascii="Calibri" w:hAnsi="Calibri"/>
                 <w:sz w:val="19"/>
               </w:rPr>
-              <w:t>Explains the current source flow, the default rolling 12-month boundary, and the optional all-available historical scope.</w:t>
+              <w:t>Explains the current source flow, the default rolling 12-month Regulations.gov boundary, and the optional historical Federal Register scope.</w:t>
             </w:r>
           </w:p>
         </w:tc>
@@ -3712,7 +3712,7 @@
                 <w:rFonts w:ascii="Calibri" w:hAnsi="Calibri"/>
                 <w:sz w:val="19"/>
               </w:rPr>
-              <w:t>A validated topic term is sent server-side to the Regulations.gov v4 documents endpoint with agency CPSC. The default scope applies a rolling 12-month posted-date filter; the user may instead select all available CPSC records, which omits that date filter. If Regulations.gov is rate-limited or unavailable, the interface labels and uses an official FederalRegister.gov fallback, whose coverage is limited to Federal Register records. Results include official links, retrieval time, selected scope, pagination, and coverage limits.</w:t>
+              <w:t>A validated topic term defaults to the Regulations.gov v4 documents endpoint with agency CPSC and a rolling 12-month posted-date filter. For older topics, the user may select an official FederalRegister.gov historical search with no publication-date filter. If Regulations.gov is rate-limited or unavailable in the default scope, the interface also labels and uses the narrower Federal Register fallback. Results include official links, retrieval time, selected scope, pagination, and coverage limits.</w:t>
             </w:r>
           </w:p>
         </w:tc>
@@ -3885,7 +3885,7 @@
     </w:p>
     <w:p>
       <w:r>
-        <w:t>The deployed interface executes an official-source research flow. By default, a query searches CPSC document records posted during the rolling 12 months ending on the retrieval date. For older topics—such as a notice that predates that window—the user may select “All available CPSC records,” which submits the same official query without a posted-date filter. Selecting a result drives verified metadata and selected-docket comment lookup. Issue analysis is withheld, and the draft area begins empty, unless a future validated evidence pipeline is implemented.</w:t>
+        <w:t>The deployed interface executes an official-source research flow. By default, a query searches Regulations.gov CPSC document records posted during the rolling 12 months ending on the retrieval date. For older topics—such as a notice that predates that window—the user may select “Historical Federal Register records,” which queries official CPSC Federal Register records without a publication-date filter. Selecting a result drives verified metadata and selected-docket comment lookup when the official metadata supplies a docket ID. Issue analysis is withheld, and the draft area begins empty, unless a future validated evidence pipeline is implemented.</w:t>
       </w:r>
     </w:p>
     <w:p>
@@ -3899,7 +3899,7 @@
         <w:t xml:space="preserve">Run the live search: </w:t>
       </w:r>
       <w:r>
-        <w:t>Validate a 2–80 character topic term and query the Regulations.gov documents endpoint with agency=CPSC. In the default scope, apply postedDate greater than or equal to the date 12 calendar months before retrieval. In the all-available scope, omit the posted-date filter. Display at most 20 records per page and the first five pages, and label the selected scope.</w:t>
+        <w:t>Validate a 2–80 character topic term. In the default scope, query Regulations.gov with agency=CPSC and postedDate greater than or equal to the date 12 calendar months before retrieval. In the historical scope, query official CPSC Federal Register records without a publication-date filter. Display at most 20 records per page and the first five pages, and label the selected source and scope.</w:t>
       </w:r>
     </w:p>
     <w:p>
@@ -4030,7 +4030,7 @@
         <w:t xml:space="preserve">Public-source limitations. </w:t>
       </w:r>
       <w:r>
-        <w:t>Live search covers the Regulations.gov documents endpoint for CPSC records, with a default rolling 12-month scope and an optional all-available scope, 20 records per page, and at most five pages. “All available” means the official API query has no posted-date filter; it does not guarantee every historical CPSC publication or overcome API indexing and pagination limits. When Regulations.gov is rate-limited or unavailable, the labeled FederalRegister.gov fallback unions up to 1,000 matches for each of the first five query terms, removes duplicates, ranks title-term overlap, and exposes at most five pages; it covers Federal Register documents rather than all Regulations.gov document types. The workspace does not claim complete coverage of comments or attachments. Records can be corrected, withdrawn, or posted after retrieval.</w:t>
+        <w:t>Default live search covers the Regulations.gov documents endpoint for CPSC records in a rolling 12-month scope, with 20 records per page and at most five pages. Historical search covers official CPSC Federal Register records without a publication-date filter; it is not a claim of every historical CPSC or Regulations.gov record. The FederalRegister.gov historical/fallback path unions up to 1,000 matches for each of the first five query terms, removes duplicates, ranks title-term overlap, and exposes at most five pages. The workspace does not claim complete coverage of comments or attachments. Records can be corrected, withdrawn, or posted after retrieval.</w:t>
       </w:r>
     </w:p>
     <w:p>

</xml_diff>

<commit_message>
Add source-grounded issue matrix and audit trail
</commit_message>
<xml_diff>
--- a/public/CPSC_Regulatory_Analysis_Foundry_Methodology.docx
+++ b/public/CPSC_Regulatory_Analysis_Foundry_Methodology.docx
@@ -513,7 +513,7 @@
                 <w:rFonts w:ascii="Calibri" w:hAnsi="Calibri"/>
                 <w:sz w:val="19"/>
               </w:rPr>
-              <w:t>1 notice/document and 31 public submissions returned by the Regulations.gov API</w:t>
+              <w:t>Retrieved live from the selected official endpoint and labeled with retrieval time</w:t>
             </w:r>
           </w:p>
         </w:tc>
@@ -537,7 +537,7 @@
                 <w:rFonts w:ascii="Calibri" w:hAnsi="Calibri"/>
                 <w:sz w:val="19"/>
               </w:rPr>
-              <w:t>This is a dated observation, not a permanently hard-coded total.</w:t>
+              <w:t>The interface does not present a permanently hard-coded comment or document total.</w:t>
             </w:r>
           </w:p>
         </w:tc>
@@ -670,7 +670,7 @@
                 <w:rFonts w:ascii="Calibri" w:hAnsi="Calibri"/>
                 <w:sz w:val="19"/>
               </w:rPr>
-              <w:t>Private deployed prototype with representative issue analysis and draft responses</w:t>
+              <w:t>Public live-source research interface with official-text issue extraction and device-local audit events</w:t>
             </w:r>
           </w:p>
         </w:tc>
@@ -694,7 +694,7 @@
                 <w:rFonts w:ascii="Calibri" w:hAnsi="Calibri"/>
                 <w:sz w:val="19"/>
               </w:rPr>
-              <w:t>It is not yet connected to a live ingestion service, database, or production approval API.</w:t>
+              <w:t>It is not connected to a production database, identity-bound approval service, immutable audit store, or live six-agent workflow.</w:t>
             </w:r>
           </w:p>
         </w:tc>
@@ -3321,7 +3321,7 @@
                 <w:rFonts w:ascii="Calibri" w:hAnsi="Calibri"/>
                 <w:sz w:val="19"/>
               </w:rPr>
-              <w:t>A selected search result drives Overview context, Regulation metadata, docket comment lookup, evidence availability, draft notes, and QA. A new query or clear action removes stale state.</w:t>
+              <w:t>A selected search result drives Regulation metadata, docket comment lookup, source-grounded issue extraction, draft notes, and QA. The executive overview remains an independent agency-wide view. A new query or clear action removes stale state.</w:t>
             </w:r>
           </w:p>
         </w:tc>
@@ -3453,7 +3453,7 @@
                 <w:rFonts w:ascii="Calibri" w:hAnsi="Calibri"/>
                 <w:sz w:val="19"/>
               </w:rPr>
-              <w:t>Explicitly unavailable without evidence</w:t>
+              <w:t>Functional official-text extraction</w:t>
             </w:r>
           </w:p>
         </w:tc>
@@ -3478,7 +3478,7 @@
                 <w:rFonts w:ascii="Calibri" w:hAnsi="Calibri"/>
                 <w:sz w:val="19"/>
               </w:rPr>
-              <w:t>The workspace shows verified metadata and source pointers but withholds topics, stances, and recommendations until a validated full-text and attachment evidence pipeline exists.</w:t>
+              <w:t>For records with a Federal Register document number, the workspace retrieves official full text and applies deterministic keyword-taxonomy extraction. Every issue row cites exact source passages, discloses algorithm version and retrieval time, and remains unreviewed. It does not infer commenter positions or agency recommendations.</w:t>
             </w:r>
           </w:p>
         </w:tc>
@@ -3635,7 +3635,7 @@
                 <w:rFonts w:ascii="Calibri" w:hAnsi="Calibri"/>
                 <w:sz w:val="19"/>
               </w:rPr>
-              <w:t>Explains the current source flow, the default rolling 12-month Regulations.gov boundary, and the optional historical Federal Register scope.</w:t>
+              <w:t>Explains the executive-overview-first flow, live source scopes, selected-record review, issue extraction, audit trail, and human-review boundary; it includes a prominent Word methodology download.</w:t>
             </w:r>
           </w:p>
         </w:tc>
@@ -3742,7 +3742,7 @@
                 <w:rFonts w:ascii="Calibri" w:hAnsi="Calibri"/>
                 <w:sz w:val="19"/>
               </w:rPr>
-              <w:t>Durable review persistence</w:t>
+              <w:t>Audit trail</w:t>
             </w:r>
           </w:p>
         </w:tc>
@@ -3767,7 +3767,7 @@
                 <w:rFonts w:ascii="Calibri" w:hAnsi="Calibri"/>
                 <w:sz w:val="19"/>
               </w:rPr>
-              <w:t>Not implemented in the deployed interface</w:t>
+              <w:t>Functional device-local record</w:t>
             </w:r>
           </w:p>
         </w:tc>
@@ -3792,7 +3792,7 @@
                 <w:rFonts w:ascii="Calibri" w:hAnsi="Calibri"/>
                 <w:sz w:val="19"/>
               </w:rPr>
-              <w:t>Edits and dispositions are not yet committed to PostgreSQL or a production audit log.</w:t>
+              <w:t>The browser records query/scope/source/retrieval metadata, selected record and docket, comment retrieval, full-text analysis inputs and algorithm version, outcomes, and draft saves. It persists only on that device and is not immutable, identity-bound, or a federal system of record.</w:t>
             </w:r>
           </w:p>
         </w:tc>
@@ -3885,7 +3885,7 @@
     </w:p>
     <w:p>
       <w:r>
-        <w:t>The deployed interface executes an official-source research flow. By default, a query searches Regulations.gov CPSC document records posted during the rolling 12 months ending on the retrieval date. For older topics—such as a notice that predates that window—the user may select “Historical Federal Register records,” which queries official CPSC Federal Register records without a publication-date filter. Selecting a result drives verified metadata and selected-docket comment lookup when the official metadata supplies a docket ID. Issue analysis is withheld, and the draft area begins empty, unless a future validated evidence pipeline is implemented.</w:t>
+        <w:t>The deployed interface begins with an independent executive overview, then executes a selected-record official-source research flow. By default, search covers Regulations.gov CPSC document records posted during the rolling 12 months ending on retrieval. For older topics, the user may select “Historical Federal Register records.” Selecting a result drives verified metadata, selected-docket comment lookup when a docket ID exists, and deterministic issue extraction when an official Federal Register full-text identifier exists. The issue matrix cites exact source passages and remains unreviewed; the draft area begins empty and stays human-authored.</w:t>
       </w:r>
     </w:p>
     <w:p>
@@ -4074,7 +4074,7 @@
         <w:t xml:space="preserve">Workspace limitations. </w:t>
       </w:r>
       <w:r>
-        <w:t>The deployed workspace has live bounded document search, an independent executive overview, selected-record metadata, and selected-docket comment listing. It deliberately does not generate issue analysis or recommended responses without sufficient validated source text. It is not a system of record and does not make agency decisions.</w:t>
+        <w:t>The deployed workspace has live bounded document search, an independent executive overview, selected-record metadata, selected-docket comment listing, official-text issue extraction, and a device-local audit trail. Issue extraction is available only when an official Federal Register text identifier resolves; it does not analyze comment attachments or infer commenter positions. The audit trail is not immutable or server-persisted. The workspace does not generate recommended responses, is not a system of record, and does not make agency decisions.</w:t>
       </w:r>
     </w:p>
     <w:p>

</xml_diff>

<commit_message>
Build live public-comment theme matrix
</commit_message>
<xml_diff>
--- a/public/CPSC_Regulatory_Analysis_Foundry_Methodology.docx
+++ b/public/CPSC_Regulatory_Analysis_Foundry_Methodology.docx
@@ -670,7 +670,7 @@
                 <w:rFonts w:ascii="Calibri" w:hAnsi="Calibri"/>
                 <w:sz w:val="19"/>
               </w:rPr>
-              <w:t>Public live-source research interface with official-text issue extraction and device-local audit events</w:t>
+              <w:t>Public live-source research interface with deterministic public-comment theme grouping and device-local audit events</w:t>
             </w:r>
           </w:p>
         </w:tc>
@@ -3321,7 +3321,7 @@
                 <w:rFonts w:ascii="Calibri" w:hAnsi="Calibri"/>
                 <w:sz w:val="19"/>
               </w:rPr>
-              <w:t>A selected search result drives Regulation metadata, docket comment lookup, source-grounded issue extraction, draft notes, and QA. The executive overview remains an independent agency-wide view. A new query or clear action removes stale state.</w:t>
+              <w:t>A selected search result drives Regulation metadata, docket comment lookup, source-grounded comment-theme grouping, draft notes, and QA. The executive overview remains an independent agency-wide view. A new query or clear action removes stale state.</w:t>
             </w:r>
           </w:p>
         </w:tc>
@@ -3453,7 +3453,7 @@
                 <w:rFonts w:ascii="Calibri" w:hAnsi="Calibri"/>
                 <w:sz w:val="19"/>
               </w:rPr>
-              <w:t>Functional official-text extraction</w:t>
+              <w:t>Functional public-comment theme grouping</w:t>
             </w:r>
           </w:p>
         </w:tc>
@@ -3478,7 +3478,7 @@
                 <w:rFonts w:ascii="Calibri" w:hAnsi="Calibri"/>
                 <w:sz w:val="19"/>
               </w:rPr>
-              <w:t>For records with a Federal Register document number, the workspace retrieves official full text and applies deterministic keyword-taxonomy extraction. Every issue row cites exact source passages, discloses algorithm version and retrieval time, and remains unreviewed. It does not infer commenter positions or agency recommendations.</w:t>
+              <w:t>For selected records with a docket ID, the workspace retrieves accessible official Regulations.gov public-comment metadata and text, then applies a disclosed deterministic taxonomy. Theme rows list official comment IDs, source links, retrieval time, and exact published submitter name/organization fields; unavailable or redacted fields are labeled. Rows remain unreviewed and are pattern groupings—not findings or legal conclusions.</w:t>
             </w:r>
           </w:p>
         </w:tc>
@@ -3635,7 +3635,7 @@
                 <w:rFonts w:ascii="Calibri" w:hAnsi="Calibri"/>
                 <w:sz w:val="19"/>
               </w:rPr>
-              <w:t>Explains the executive-overview-first flow, live source scopes, selected-record review, issue extraction, audit trail, and human-review boundary; it includes a prominent Word methodology download.</w:t>
+              <w:t>Explains the executive-overview-first flow, live source scopes, selected-record review, public-comment theme grouping, audit trail, and human-review boundary; it includes a prominent Word methodology download.</w:t>
             </w:r>
           </w:p>
         </w:tc>
@@ -3885,7 +3885,7 @@
     </w:p>
     <w:p>
       <w:r>
-        <w:t>The deployed interface begins with an independent executive overview, then executes a selected-record official-source research flow. By default, search covers Regulations.gov CPSC document records posted during the rolling 12 months ending on retrieval. For older topics, the user may select “Historical Federal Register records.” Selecting a result drives verified metadata, selected-docket comment lookup when a docket ID exists, and deterministic issue extraction when an official Federal Register full-text identifier exists. The issue matrix cites exact source passages and remains unreviewed; the draft area begins empty and stays human-authored.</w:t>
+        <w:t>The deployed interface begins with an independent executive overview, then executes a selected-record official-source research flow. By default, search covers Regulations.gov CPSC document records posted during the rolling 12 months ending on retrieval. For older topics, the user may select “Historical Federal Register records.” Selecting a result drives verified metadata, selected-docket comment lookup when a docket ID exists, and deterministic grouping of accessible official public-comment text. The theme matrix cites official comment IDs and source links, preserves only published submitter fields, and remains unreviewed; the draft area begins empty and stays human-authored.</w:t>
       </w:r>
     </w:p>
     <w:p>
@@ -4074,7 +4074,7 @@
         <w:t xml:space="preserve">Workspace limitations. </w:t>
       </w:r>
       <w:r>
-        <w:t>The deployed workspace has live bounded document search, an independent executive overview, selected-record metadata, selected-docket comment listing, official-text issue extraction, and a device-local audit trail. Issue extraction is available only when an official Federal Register text identifier resolves; it does not analyze comment attachments or infer commenter positions. The audit trail is not immutable or server-persisted. The workspace does not generate recommended responses, is not a system of record, and does not make agency decisions.</w:t>
+        <w:t>The deployed workspace has live bounded document search, an independent executive overview, selected-record metadata, selected-docket comment listing, deterministic theme grouping over accessible public comment text, and a device-local audit trail. The current run analyzes a disclosed subset because the public API is credential/rate limited; it does not analyze attachments, private fields, withdrawn comments, or unavailable text, and theme counts are not docket-wide prevalence. The audit trail is not immutable or server-persisted. The workspace does not generate recommended responses, is not a system of record, and does not make agency decisions.</w:t>
       </w:r>
     </w:p>
     <w:p>

</xml_diff>

<commit_message>
Refine issue matrix hazards and retrieval safeguards
</commit_message>
<xml_diff>
--- a/public/CPSC_Regulatory_Analysis_Foundry_Methodology.docx
+++ b/public/CPSC_Regulatory_Analysis_Foundry_Methodology.docx
@@ -4306,6 +4306,22 @@
         <w:t>Prepared as a methodology and operating guide. This document does not state or imply an official CPSC determination.</w:t>
       </w:r>
     </w:p>
+    <w:p>
+      <w:pPr>
+        <w:pStyle w:val="Heading2"/>
+      </w:pPr>
+      <w:r>
+        <w:t>Comment-theme matrix and retrieval safeguards</w:t>
+      </w:r>
+    </w:p>
+    <w:p>
+      <w:pPr>
+        <w:spacing w:after="120"/>
+      </w:pPr>
+      <w:r>
+        <w:t>The Issues matrix groups accessible official public-comment text into general themes, such as consumer safety and risk. Theme counts represent supporting comments in the analyzed subset and are not docket-wide prevalence. Hazard domains are assigned at the individual-comment level, not at the theme level. A comment may receive multiple evidence-based hazard domains, including electrical, mechanical, thermal, chemical, fire/explosion, choking/ingestion, laceration, fall/tip-over, entrapment/strangulation, toxicological, and labeling/instruction. Each tag is based on disclosed whole-word or stem matches; unmatched comments are marked Unclear/Needs review. Successful official API responses are briefly cached, simultaneous duplicate requests are coalesced, and transient rate-limit or server failures use bounded exponential backoff with jitter and Retry-After timing when supplied. These controls reduce repeat traffic and make the service more resilient; they do not bypass official API limits.</w:t>
+      </w:r>
+    </w:p>
     <w:sectPr>
       <w:headerReference w:type="default" r:id="rId9"/>
       <w:footerReference w:type="default" r:id="rId10"/>

</xml_diff>